<commit_message>
Update client site files
</commit_message>
<xml_diff>
--- a/Euree_Growth/temp/Euree_Growth-Monthly-2025-12-31-Cover.docx
+++ b/Euree_Growth/temp/Euree_Growth-Monthly-2025-12-31-Cover.docx
@@ -10418,8 +10418,8 @@
 </file>
 
 <file path=customXml/item1.xml><?xml version="1.0" encoding="utf-8"?>
-<ct:contentTypeSchema xmlns:ct="http://schemas.microsoft.com/office/2006/metadata/contentType" xmlns:ma="http://schemas.microsoft.com/office/2006/metadata/properties/metaAttributes" ct:_="" ma:_="" ma:contentTypeName="Document" ma:contentTypeID="0x0101005C6577D0C3AE724BBB504F46D5A19401" ma:contentTypeVersion="18" ma:contentTypeDescription="Create a new document." ma:contentTypeScope="" ma:versionID="17afb16e0fbe716d3dcf2481b32b5550">
-  <xsd:schema xmlns:xsd="http://www.w3.org/2001/XMLSchema" xmlns:xs="http://www.w3.org/2001/XMLSchema" xmlns:p="http://schemas.microsoft.com/office/2006/metadata/properties" xmlns:ns2="df76e320-99cb-4a11-b59f-8bf32867ab70" xmlns:ns3="c0789f30-979e-497b-8344-faefb3987540" targetNamespace="http://schemas.microsoft.com/office/2006/metadata/properties" ma:root="true" ma:fieldsID="f6d0bb8d4e6a5d6b988ea2ed2503dbb5" ns2:_="" ns3:_="">
+<ct:contentTypeSchema xmlns:ct="http://schemas.microsoft.com/office/2006/metadata/contentType" xmlns:ma="http://schemas.microsoft.com/office/2006/metadata/properties/metaAttributes" ct:_="" ma:_="" ma:contentTypeName="Document" ma:contentTypeID="0x0101005C6577D0C3AE724BBB504F46D5A19401" ma:contentTypeVersion="18" ma:contentTypeDescription="Create a new document." ma:contentTypeScope="" ma:versionID="0faa3b765bc3ad41758b2d0c38fa1b25">
+  <xsd:schema xmlns:xsd="http://www.w3.org/2001/XMLSchema" xmlns:xs="http://www.w3.org/2001/XMLSchema" xmlns:p="http://schemas.microsoft.com/office/2006/metadata/properties" xmlns:ns2="df76e320-99cb-4a11-b59f-8bf32867ab70" xmlns:ns3="c0789f30-979e-497b-8344-faefb3987540" targetNamespace="http://schemas.microsoft.com/office/2006/metadata/properties" ma:root="true" ma:fieldsID="223fee81cbe4f33532603c1ca066db92" ns2:_="" ns3:_="">
     <xsd:import namespace="df76e320-99cb-4a11-b59f-8bf32867ab70"/>
     <xsd:import namespace="c0789f30-979e-497b-8344-faefb3987540"/>
     <xsd:element name="properties">
@@ -10697,22 +10697,7 @@
 </file>
 
 <file path=customXml/itemProps1.xml><?xml version="1.0" encoding="utf-8"?>
-<ds:datastoreItem xmlns:ds="http://schemas.openxmlformats.org/officeDocument/2006/customXml" ds:itemID="{7A0F0D45-B5B0-4593-81B9-A8D609F21713}">
-  <ds:schemaRefs>
-    <ds:schemaRef ds:uri="http://schemas.microsoft.com/office/2006/metadata/contentType"/>
-    <ds:schemaRef ds:uri="http://schemas.microsoft.com/office/2006/metadata/properties/metaAttributes"/>
-    <ds:schemaRef ds:uri="http://www.w3.org/2001/XMLSchema"/>
-    <ds:schemaRef ds:uri="http://schemas.microsoft.com/office/2006/metadata/properties"/>
-    <ds:schemaRef ds:uri="df76e320-99cb-4a11-b59f-8bf32867ab70"/>
-    <ds:schemaRef ds:uri="c0789f30-979e-497b-8344-faefb3987540"/>
-    <ds:schemaRef ds:uri="http://schemas.microsoft.com/office/2006/documentManagement/types"/>
-    <ds:schemaRef ds:uri="http://schemas.microsoft.com/office/infopath/2007/PartnerControls"/>
-    <ds:schemaRef ds:uri="http://schemas.openxmlformats.org/package/2006/metadata/core-properties"/>
-    <ds:schemaRef ds:uri="http://purl.org/dc/elements/1.1/"/>
-    <ds:schemaRef ds:uri="http://purl.org/dc/terms/"/>
-    <ds:schemaRef ds:uri="http://schemas.microsoft.com/internal/obd"/>
-  </ds:schemaRefs>
-</ds:datastoreItem>
+<ds:datastoreItem xmlns:ds="http://schemas.openxmlformats.org/officeDocument/2006/customXml" ds:itemID="{05EA16AE-0B06-438F-B008-6796EF78AF0D}"/>
 </file>
 
 <file path=customXml/itemProps2.xml><?xml version="1.0" encoding="utf-8"?>

</xml_diff>